<commit_message>
Final proofread of book review and add page numbers above footer
Co-Authored-By: Claude Opus 5.5 <noreply@anthropic.com>
Claude-Session: https://claude.ai/code/session_01LyAEdHGJyBVYLz5Wq2uw9J
</commit_message>
<xml_diff>
--- a/Review_of_Commando_Winning_the_Green_Beret.docx
+++ b/Review_of_Commando_Winning_the_Green_Beret.docx
@@ -155,7 +155,7 @@
           <w:sz w:val="24"/>
           <w:szCs w:val="24"/>
         </w:rPr>
-        <w:t xml:space="preserve">, a five-part television documentary which McManners devised with the producer-director Charles Thompson from more than forty hours of footage.</w:t>
+        <w:t xml:space="preserve">, a five-part documentary series which McManners devised with the producer-director Charles Thompson for Westcountry Television, distilled from more than forty hours of footage.</w:t>
       </w:r>
       <w:r>
         <w:rPr>
@@ -173,7 +173,7 @@
           <w:sz w:val="24"/>
           <w:szCs w:val="24"/>
         </w:rPr>
-        <w:t xml:space="preserve"> It tracks two courses through the bitter winter of 1992: 638 Recruit Troop, young Royal Marines in the final phase of their training, and All Arms Commando Course 4/92, volunteers from the Army, Royal Navy and Royal Air Force who must pass exactly the same tests. The result is a gripping, first-hand study of selection, endurance and leadership that speaks directly to every officer who must train, judge or lead soldiers.</w:t>
+        <w:t xml:space="preserve"> It tracks two courses through the bitter winter of 1992: 638 Recruit Troop, young Royal Marines recruits in the final phase of their training, and All Arms Commando Course 4/92, volunteers from the Army, Royal Navy and Royal Air Force who must pass the very same Commando Tests. The result is a gripping, first-hand study of selection, endurance and leadership that speaks directly to every officer who must train, judge or lead soldiers.</w:t>
       </w:r>
     </w:p>
     <w:p>
@@ -230,7 +230,7 @@
           <w:sz w:val="24"/>
           <w:szCs w:val="24"/>
         </w:rPr>
-        <w:t xml:space="preserve"> by Hugh McManners with the objective of drawing lessons, assessing its scope and relevance and making recommendations.</w:t>
+        <w:t xml:space="preserve"> by Hugh McManners with the objective of drawing lessons, assessing its scope and relevance, and making recommendations.</w:t>
       </w:r>
     </w:p>
     <w:p>
@@ -480,7 +480,7 @@
           <w:sz w:val="24"/>
           <w:szCs w:val="24"/>
         </w:rPr>
-        <w:t xml:space="preserve"> Commissioned into the Royal Artillery in 1973, he passed the All Arms Commando Course himself and spent most of his service with 148 (Meiktila) Commando Forward Observation Battery, qualifying as a commando, military parachutist and army diving supervisor. He also commanded the British Army’s jungle warfare school in Belize.</w:t>
+        <w:t xml:space="preserve"> Commissioned into the Royal Artillery in 1973, he passed the All Arms Commando Course himself and served five years with 148 (Meiktila) Commando Forward Observation Battery, qualifying as a commando, military parachutist and army diving supervisor. He also ran the British Army’s jungle warfare training school in Belize.</w:t>
       </w:r>
       <w:r>
         <w:rPr>
@@ -513,7 +513,7 @@
           <w:sz w:val="24"/>
           <w:szCs w:val="24"/>
         </w:rPr>
-        <w:t xml:space="preserve">In the Falklands War of 1982 he led a five-man naval gunfire observation team with the Special Boat Service behind enemy lines and was Mentioned in Despatches.</w:t>
+        <w:t xml:space="preserve">In the Falklands War of 1982 he led a five-man naval gunfire forward observation team operating with the Special Boat Service, and was Mentioned in Despatches.</w:t>
       </w:r>
       <w:r>
         <w:rPr>
@@ -548,7 +548,7 @@
           <w:sz w:val="24"/>
           <w:szCs w:val="24"/>
         </w:rPr>
-        <w:t xml:space="preserve">, and built a distinguished career as an author and television producer. His fifteen books include </w:t>
+        <w:t xml:space="preserve">, and built a distinguished career as an author and television producer. His fifteen or so books include </w:t>
       </w:r>
       <w:r>
         <w:rPr>
@@ -830,7 +830,7 @@
           <w:sz w:val="24"/>
           <w:szCs w:val="24"/>
         </w:rPr>
-        <w:t xml:space="preserve">The hardback is an attractive large-format volume, richly illustrated with colour and black-and-white photographs, an organisation chart of Commando Forces, a diagram of the endurance course and captioned photographs that name every member of both courses. The typeface is clear and the layout open, making it a pleasure to handle and to read. Copies are readily available online in hardback, paperback and electronic form.</w:t>
+        <w:t xml:space="preserve">The hardback is an attractive large-format volume, richly illustrated with photographs taken during filming, an organisation chart of Commando Forces, a diagram of the endurance course and captioned group photographs that name the members of both courses. The typeface is clear and the layout open, making it a pleasure to handle and to read. Copies are readily available online in hardback, paperback and electronic form.</w:t>
       </w:r>
       <w:r>
         <w:rPr>
@@ -898,7 +898,7 @@
           <w:sz w:val="24"/>
           <w:szCs w:val="24"/>
         </w:rPr>
-        <w:t xml:space="preserve"> In doing so he replaces the Hollywood image of “gung ho, super-fit Captain Hurricanes” with the truth: “quiet, often tired, but determined bodies of men, working together to overcome adversity”.</w:t>
+        <w:t xml:space="preserve"> In doing so he replaces the popular image of “gung ho, super-fit Captain Hurricanes” with the truth: “quiet, often tired, but determined bodies of men, working together to overcome adversity”.</w:t>
       </w:r>
       <w:r>
         <w:rPr>
@@ -1062,7 +1062,7 @@
           <w:sz w:val="24"/>
           <w:szCs w:val="24"/>
         </w:rPr>
-        <w:t xml:space="preserve">638 Troop learn amphibious raiding at Royal Marines Poole and launch their Final Exercise with a night raid on the fort at Portland breakwater. Ambushed in their lorries and then mounting their own dawn ambush, they learn hard lessons about alertness, fieldcraft and integrity under the watchful eyes of Lieutenant Archie Gillies and his training team.</w:t>
+        <w:t xml:space="preserve">638 Troop learn amphibious raiding at Royal Marines Poole and launch their Final Exercise with a night raid on the fort at the end of the Portland breakwater. Ambushed in their lorries and then mounting their own dawn ambush, they learn hard lessons about alertness, fieldcraft and integrity under the watchful eyes of Lieutenant Archie Gillies and his training team.</w:t>
       </w:r>
       <w:r>
         <w:rPr>
@@ -1168,7 +1168,7 @@
           <w:sz w:val="24"/>
           <w:szCs w:val="24"/>
         </w:rPr>
-        <w:t xml:space="preserve">The troop face the endurance course, the 9-mile speed march, the Tarzan assault course and the 30-mile march across Dartmoor. Recruit Spink wins the King’s Badge, an honour instituted by King George V in 1918,</w:t>
+        <w:t xml:space="preserve">The troop face the endurance course, the 9-mile speed march, the Tarzan assault course and the 30-mile march across Dartmoor, which every man who starts completes inside eight hours. Recruit Spink wins the King’s Badge, an honour instituted by King George V in 1918,</w:t>
       </w:r>
       <w:r>
         <w:rPr>
@@ -1261,7 +1261,7 @@
           <w:sz w:val="24"/>
           <w:szCs w:val="24"/>
         </w:rPr>
-        <w:t xml:space="preserve">The book carries the unmistakable authority of an insider. McManners has passed the very course he describes, served thirteen years in 3 Commando Brigade and proved the commando ethos in battle in the Falklands. His privileged access, for which the Commandant “opened every door”, allowed him to live alongside instructors and candidates for weeks, and the Commandant and training teams checked his manuscript for accuracy.</w:t>
+        <w:t xml:space="preserve">The book carries the unmistakable authority of an insider. McManners has passed the very course he describes, served thirteen years in 3 Commando Brigade and proved the commando ethos in battle in the Falklands. His privileged access, for which the Commandant “opened every door”, allowed him to observe instructors and candidates at close quarters for weeks, and the Commandant and training teams checked his manuscript for accuracy.</w:t>
       </w:r>
       <w:r>
         <w:rPr>
@@ -1319,7 +1319,7 @@
           <w:sz w:val="24"/>
           <w:szCs w:val="24"/>
         </w:rPr>
-        <w:t xml:space="preserve">This is one of the first and finest accounts of commando selection written by a qualified insider for a wide readership. </w:t>
+        <w:t xml:space="preserve">This is one of the finest accounts of commando selection ever written by a qualified insider for a wide readership. </w:t>
       </w:r>
       <w:r>
         <w:rPr>
@@ -1354,7 +1354,7 @@
           <w:sz w:val="24"/>
           <w:szCs w:val="24"/>
         </w:rPr>
-        <w:t xml:space="preserve"> and it set the pattern for later celebrated works on Royal Marines training. Its enduring contribution is to show that the Green Beret rewards character rather than muscle; as Major Jon Lear puts it, “Only 20 per cent of the training is physical, the rest being mental.”</w:t>
+        <w:t xml:space="preserve"> and it anticipated later celebrated works on Royal Marines training. Its enduring contribution is to show that the Green Beret rewards character rather than muscle; as Major Jon Lear puts it, “Only 20 per cent of the training is physical, the rest being mental.”</w:t>
       </w:r>
       <w:r>
         <w:rPr>
@@ -1664,7 +1664,7 @@
           <w:sz w:val="24"/>
           <w:szCs w:val="24"/>
         </w:rPr>
-        <w:t xml:space="preserve">The book is easily understood in both organisation and phrasing. Its chapters follow the course in logical sequence, building steadily towards the climax of the Commando Tests. Military terms are explained in brackets as they arise, so that even the civilian reader is never lost. The illustrations are outstanding: the organisation chart, the endurance course diagram and the captioned group photographs help the reader follow every character, while images such as Recruit Jaftha poised at the edge of the chasm say more than words could.</w:t>
+        <w:t xml:space="preserve">The book is easily understood in both organisation and phrasing. Its chapters follow the course in logical sequence, building steadily towards the climax of the Commando Tests. Military terms are explained in brackets as they arise, so that even the civilian reader is never lost. The illustrations are outstanding: the organisation chart, the endurance course diagram and the captioned group photographs help the reader to follow the characters, while images such as Recruit Jaftha poised at the edge of the chasm say more than words could.</w:t>
       </w:r>
       <w:r>
         <w:rPr>
@@ -1870,7 +1870,7 @@
           <w:sz w:val="24"/>
           <w:szCs w:val="24"/>
         </w:rPr>
-        <w:t xml:space="preserve">The book is a rich source of inspiration. Senior commanders such as Colonel Mike Taffinder, Major Jon Lear and Captain Leo Williams show how leaders who know their men can take hard decisions with fairness and compassion. The courage on display is both physical and moral: Recruit Jaftha returning again and again to the obstacle that broke his leg until he conquers it, and Sergeant Major Dobson declaring through his pain that “warrant officers can’t wrap”.</w:t>
+        <w:t xml:space="preserve">The book is a rich source of inspiration. Senior commanders such as Colonel Mike Taffinder, Major Jon Lear and Captain Leo Williams show how leaders who know their men can take hard decisions with fairness and compassion. The courage on display is both physical and moral: Recruit Jaftha returning again and again to the obstacle that broke his leg until he finally conquers it, and Sergeant Major Dobson declaring through his pain that “warrant officers can’t wrap”.</w:t>
       </w:r>
       <w:r>
         <w:rPr>
@@ -2447,6 +2447,21 @@
 
 <file path=word/footer1.xml><?xml version="1.0" encoding="utf-8"?>
 <w:ftr xmlns:m="http://schemas.openxmlformats.org/officeDocument/2006/math" xmlns:mc="http://schemas.openxmlformats.org/markup-compatibility/2006" xmlns:mo="http://schemas.microsoft.com/office/mac/office/2008/main" xmlns:mv="urn:schemas-microsoft-com:mac:vml" xmlns:o="urn:schemas-microsoft-com:office:office" xmlns:r="http://schemas.openxmlformats.org/officeDocument/2006/relationships" xmlns:v="urn:schemas-microsoft-com:vml" xmlns:w10="urn:schemas-microsoft-com:office:word" xmlns:w14="http://schemas.microsoft.com/office/word/2010/wordml" xmlns:w="http://schemas.openxmlformats.org/wordprocessingml/2006/main" xmlns:wne="http://schemas.microsoft.com/office/word/2006/wordml" xmlns:wp14="http://schemas.microsoft.com/office/word/2010/wordprocessingDrawing" xmlns:wp="http://schemas.openxmlformats.org/drawingml/2006/wordprocessingDrawing" xmlns:wpc="http://schemas.microsoft.com/office/word/2010/wordprocessingCanvas" xmlns:wpg="http://schemas.microsoft.com/office/word/2010/wordprocessingGroup" xmlns:wpi="http://schemas.microsoft.com/office/word/2010/wordprocessingInk" xmlns:wps="http://schemas.microsoft.com/office/word/2010/wordprocessingShape" mc:Ignorable="w14 wp14">
+  <w:p>
+    <w:pPr>
+      <w:spacing w:after="120"/>
+      <w:jc w:val="center"/>
+    </w:pPr>
+    <w:fldSimple w:instr="PAGE">
+      <w:r>
+        <w:rPr>
+          <w:rFonts w:ascii="Arial" w:hAnsi="Arial" w:cs="Arial" w:eastAsia="Arial"/>
+          <w:sz w:val="24"/>
+        </w:rPr>
+        <w:t>1</w:t>
+      </w:r>
+    </w:fldSimple>
+  </w:p>
   <w:p>
     <w:pPr>
       <w:pStyle w:val="Footer"/>
@@ -2755,7 +2770,24 @@
           <w:sz w:val="18"/>
           <w:szCs w:val="18"/>
         </w:rPr>
-        <w:t xml:space="preserve">Amazon. Commando: Winning the Green Beret. Retrieved from: https://www.amazon.co.uk/Commando-Winning-Green-Beret-Network/dp/0563369817</w:t>
+        <w:t xml:space="preserve">Amazon. </w:t>
+      </w:r>
+      <w:r>
+        <w:rPr>
+          <w:rFonts w:ascii="Arial" w:hAnsi="Arial" w:cs="Arial" w:eastAsia="Arial"/>
+          <w:i/>
+          <w:sz w:val="18"/>
+          <w:szCs w:val="18"/>
+        </w:rPr>
+        <w:t xml:space="preserve">Commando: Winning the Green Beret</w:t>
+      </w:r>
+      <w:r>
+        <w:rPr>
+          <w:rFonts w:ascii="Arial" w:hAnsi="Arial" w:cs="Arial" w:eastAsia="Arial"/>
+          <w:sz w:val="18"/>
+          <w:szCs w:val="18"/>
+        </w:rPr>
+        <w:t xml:space="preserve">. Retrieved from: https://www.amazon.co.uk/Commando-Winning-Green-Beret-Network/dp/0563369817</w:t>
       </w:r>
     </w:p>
   </w:footnote>
@@ -2807,7 +2839,7 @@
           <w:sz w:val="18"/>
           <w:szCs w:val="18"/>
         </w:rPr>
-        <w:t xml:space="preserve">, p. 12 and dust jacket.</w:t>
+        <w:t xml:space="preserve">, dust jacket and p. 12.</w:t>
       </w:r>
     </w:p>
   </w:footnote>
@@ -3241,7 +3273,24 @@
           <w:sz w:val="18"/>
           <w:szCs w:val="18"/>
         </w:rPr>
-        <w:t xml:space="preserve">Publishers Weekly (1995). Review of Commando by Hugh McManners. Retrieved from: https://www.publishersweekly.com/9780563369813</w:t>
+        <w:t xml:space="preserve">Publishers Weekly (1995). Review of </w:t>
+      </w:r>
+      <w:r>
+        <w:rPr>
+          <w:rFonts w:ascii="Arial" w:hAnsi="Arial" w:cs="Arial" w:eastAsia="Arial"/>
+          <w:i/>
+          <w:sz w:val="18"/>
+          <w:szCs w:val="18"/>
+        </w:rPr>
+        <w:t xml:space="preserve">Commando</w:t>
+      </w:r>
+      <w:r>
+        <w:rPr>
+          <w:rFonts w:ascii="Arial" w:hAnsi="Arial" w:cs="Arial" w:eastAsia="Arial"/>
+          <w:sz w:val="18"/>
+          <w:szCs w:val="18"/>
+        </w:rPr>
+        <w:t xml:space="preserve"> by Hugh McManners. Retrieved from: https://www.publishersweekly.com/9780563369813</w:t>
       </w:r>
     </w:p>
   </w:footnote>

</xml_diff>